<commit_message>
updated cv with react and typescript
</commit_message>
<xml_diff>
--- a/Raza_Ahmed_CV.docx
+++ b/Raza_Ahmed_CV.docx
@@ -2,13 +2,11 @@
 <file path=word/document.xml><?xml version="1.0" encoding="utf-8"?>
 <w:document xmlns:wpc="http://schemas.microsoft.com/office/word/2010/wordprocessingCanvas" xmlns:mc="http://schemas.openxmlformats.org/markup-compatibility/2006" xmlns:o="urn:schemas-microsoft-com:office:office" xmlns:r="http://schemas.openxmlformats.org/officeDocument/2006/relationships" xmlns:m="http://schemas.openxmlformats.org/officeDocument/2006/math" xmlns:v="urn:schemas-microsoft-com:vml" xmlns:wp14="http://schemas.microsoft.com/office/word/2010/wordprocessingDrawing" xmlns:wp="http://schemas.openxmlformats.org/drawingml/2006/wordprocessingDrawing" xmlns:w10="urn:schemas-microsoft-com:office:word" xmlns:w="http://schemas.openxmlformats.org/wordprocessingml/2006/main" xmlns:w14="http://schemas.microsoft.com/office/word/2010/wordml" xmlns:w15="http://schemas.microsoft.com/office/word/2012/wordml" xmlns:wpg="http://schemas.microsoft.com/office/word/2010/wordprocessingGroup" xmlns:wpi="http://schemas.microsoft.com/office/word/2010/wordprocessingInk" xmlns:wne="http://schemas.microsoft.com/office/word/2006/wordml" xmlns:wps="http://schemas.microsoft.com/office/word/2010/wordprocessingShape" mc:Ignorable="w14 w15 wp14">
   <w:body>
-    <w:p>
-      <w:bookmarkStart w:id="0" w:name="_GoBack"/>
-      <w:bookmarkEnd w:id="0"/>
-    </w:p>
+    <w:p/>
     <w:tbl>
       <w:tblPr>
-        <w:tblW w:w="10080" w:type="dxa"/>
+        <w:tblW w:w="10260" w:type="dxa"/>
+        <w:tblInd w:w="-180" w:type="dxa"/>
         <w:tblBorders>
           <w:top w:val="single" w:sz="4" w:space="0" w:color="auto"/>
           <w:left w:val="single" w:sz="4" w:space="0" w:color="auto"/>
@@ -25,7 +23,7 @@
         <w:tblLook w:val="04A0" w:firstRow="1" w:lastRow="0" w:firstColumn="1" w:lastColumn="0" w:noHBand="0" w:noVBand="1"/>
       </w:tblPr>
       <w:tblGrid>
-        <w:gridCol w:w="1983"/>
+        <w:gridCol w:w="2163"/>
         <w:gridCol w:w="8097"/>
       </w:tblGrid>
       <w:tr>
@@ -34,7 +32,7 @@
         </w:trPr>
         <w:tc>
           <w:tcPr>
-            <w:tcW w:w="1983" w:type="dxa"/>
+            <w:tcW w:w="2163" w:type="dxa"/>
             <w:tcBorders>
               <w:top w:val="none" w:sz="0" w:space="0" w:color="FFFFFF"/>
               <w:left w:val="none" w:sz="0" w:space="0" w:color="FFFFFF"/>
@@ -520,7 +518,7 @@
               <w:tblStyle w:val="TableGrid"/>
               <w:tblpPr w:leftFromText="180" w:rightFromText="180" w:vertAnchor="text" w:horzAnchor="margin" w:tblpY="-5"/>
               <w:tblOverlap w:val="never"/>
-              <w:tblW w:w="7914" w:type="dxa"/>
+              <w:tblW w:w="8280" w:type="dxa"/>
               <w:tblInd w:w="0" w:type="dxa"/>
               <w:tblBorders>
                 <w:top w:val="none" w:sz="0" w:space="0" w:color="auto"/>
@@ -534,9 +532,10 @@
               <w:tblLook w:val="04A0" w:firstRow="1" w:lastRow="0" w:firstColumn="1" w:lastColumn="0" w:noHBand="0" w:noVBand="1"/>
             </w:tblPr>
             <w:tblGrid>
-              <w:gridCol w:w="2701"/>
-              <w:gridCol w:w="2798"/>
-              <w:gridCol w:w="2415"/>
+              <w:gridCol w:w="2790"/>
+              <w:gridCol w:w="2880"/>
+              <w:gridCol w:w="90"/>
+              <w:gridCol w:w="2520"/>
             </w:tblGrid>
             <w:tr>
               <w:trPr>
@@ -544,7 +543,7 @@
               </w:trPr>
               <w:tc>
                 <w:tcPr>
-                  <w:tcW w:w="2701" w:type="dxa"/>
+                  <w:tcW w:w="2790" w:type="dxa"/>
                   <w:hideMark/>
                 </w:tcPr>
                 <w:p>
@@ -626,7 +625,7 @@
               </w:tc>
               <w:tc>
                 <w:tcPr>
-                  <w:tcW w:w="2798" w:type="dxa"/>
+                  <w:tcW w:w="2880" w:type="dxa"/>
                   <w:hideMark/>
                 </w:tcPr>
                 <w:p>
@@ -708,7 +707,8 @@
               </w:tc>
               <w:tc>
                 <w:tcPr>
-                  <w:tcW w:w="2415" w:type="dxa"/>
+                  <w:tcW w:w="2610" w:type="dxa"/>
+                  <w:gridSpan w:val="2"/>
                   <w:hideMark/>
                 </w:tcPr>
                 <w:p>
@@ -795,7 +795,7 @@
               </w:trPr>
               <w:tc>
                 <w:tcPr>
-                  <w:tcW w:w="2701" w:type="dxa"/>
+                  <w:tcW w:w="2790" w:type="dxa"/>
                   <w:hideMark/>
                 </w:tcPr>
                 <w:p>
@@ -806,7 +806,7 @@
                       <w:b/>
                       <w:i/>
                       <w:color w:val="CCF0F0"/>
-                      <w:sz w:val="16"/>
+                      <w:sz w:val="17"/>
                       <w:szCs w:val="17"/>
                       <w14:textFill>
                         <w14:gradFill>
@@ -843,8 +843,9 @@
                       <w:b/>
                       <w:i/>
                       <w:color w:val="CCF0F0"/>
-                      <w:sz w:val="16"/>
+                      <w:sz w:val="17"/>
                       <w:szCs w:val="17"/>
+                      <w:u w:val="single"/>
                       <w14:textFill>
                         <w14:gradFill>
                           <w14:gsLst>
@@ -873,13 +874,52 @@
                         </w14:gradFill>
                       </w14:textFill>
                     </w:rPr>
-                    <w:t>linkedin.com/in/raza-ahmed333</w:t>
+                    <w:t>linkedin</w:t>
+                  </w:r>
+                  <w:r>
+                    <w:rPr>
+                      <w:rFonts w:ascii="Arial" w:eastAsia="Arial" w:hAnsi="Arial" w:cs="Arial"/>
+                      <w:b/>
+                      <w:i/>
+                      <w:color w:val="CCF0F0"/>
+                      <w:sz w:val="17"/>
+                      <w:szCs w:val="17"/>
+                      <w14:textFill>
+                        <w14:gradFill>
+                          <w14:gsLst>
+                            <w14:gs w14:pos="0">
+                              <w14:schemeClr w14:val="accent1">
+                                <w14:tint w14:val="66000"/>
+                                <w14:satMod w14:val="160000"/>
+                              </w14:schemeClr>
+                            </w14:gs>
+                            <w14:gs w14:pos="50000">
+                              <w14:schemeClr w14:val="accent1">
+                                <w14:tint w14:val="44500"/>
+                                <w14:satMod w14:val="160000"/>
+                              </w14:schemeClr>
+                            </w14:gs>
+                            <w14:gs w14:pos="100000">
+                              <w14:schemeClr w14:val="accent1">
+                                <w14:tint w14:val="23500"/>
+                                <w14:satMod w14:val="160000"/>
+                              </w14:schemeClr>
+                            </w14:gs>
+                          </w14:gsLst>
+                          <w14:path w14:path="circle">
+                            <w14:fillToRect w14:l="0" w14:t="100000" w14:r="100000" w14:b="0"/>
+                          </w14:path>
+                        </w14:gradFill>
+                      </w14:textFill>
+                    </w:rPr>
+                    <w:t>.com/in/raza-ahmed333</w:t>
                   </w:r>
                 </w:p>
               </w:tc>
               <w:tc>
                 <w:tcPr>
-                  <w:tcW w:w="2798" w:type="dxa"/>
+                  <w:tcW w:w="2970" w:type="dxa"/>
+                  <w:gridSpan w:val="2"/>
                   <w:hideMark/>
                 </w:tcPr>
                 <w:p>
@@ -890,7 +930,7 @@
                       <w:b/>
                       <w:i/>
                       <w:color w:val="CCF0F0"/>
-                      <w:sz w:val="16"/>
+                      <w:sz w:val="17"/>
                       <w:szCs w:val="17"/>
                       <w14:textFill>
                         <w14:gradFill>
@@ -927,7 +967,7 @@
                       <w:b/>
                       <w:i/>
                       <w:color w:val="CCF0F0"/>
-                      <w:sz w:val="16"/>
+                      <w:sz w:val="17"/>
                       <w:szCs w:val="17"/>
                       <w14:textFill>
                         <w14:gradFill>
@@ -957,13 +997,52 @@
                         </w14:gradFill>
                       </w14:textFill>
                     </w:rPr>
-                    <w:t>razamughal333.github.io/Portfolio</w:t>
+                    <w:t>razamughal333.github.io/</w:t>
+                  </w:r>
+                  <w:r>
+                    <w:rPr>
+                      <w:rFonts w:ascii="Arial" w:eastAsia="Arial" w:hAnsi="Arial" w:cs="Arial"/>
+                      <w:b/>
+                      <w:i/>
+                      <w:color w:val="CCF0F0"/>
+                      <w:sz w:val="17"/>
+                      <w:szCs w:val="17"/>
+                      <w:u w:val="single"/>
+                      <w14:textFill>
+                        <w14:gradFill>
+                          <w14:gsLst>
+                            <w14:gs w14:pos="0">
+                              <w14:schemeClr w14:val="accent1">
+                                <w14:tint w14:val="66000"/>
+                                <w14:satMod w14:val="160000"/>
+                              </w14:schemeClr>
+                            </w14:gs>
+                            <w14:gs w14:pos="50000">
+                              <w14:schemeClr w14:val="accent1">
+                                <w14:tint w14:val="44500"/>
+                                <w14:satMod w14:val="160000"/>
+                              </w14:schemeClr>
+                            </w14:gs>
+                            <w14:gs w14:pos="100000">
+                              <w14:schemeClr w14:val="accent1">
+                                <w14:tint w14:val="23500"/>
+                                <w14:satMod w14:val="160000"/>
+                              </w14:schemeClr>
+                            </w14:gs>
+                          </w14:gsLst>
+                          <w14:path w14:path="circle">
+                            <w14:fillToRect w14:l="0" w14:t="100000" w14:r="100000" w14:b="0"/>
+                          </w14:path>
+                        </w14:gradFill>
+                      </w14:textFill>
+                    </w:rPr>
+                    <w:t>Portfolio</w:t>
                   </w:r>
                 </w:p>
               </w:tc>
               <w:tc>
                 <w:tcPr>
-                  <w:tcW w:w="2415" w:type="dxa"/>
+                  <w:tcW w:w="2520" w:type="dxa"/>
                 </w:tcPr>
                 <w:p>
                   <w:pPr>
@@ -973,7 +1052,7 @@
                       <w:b/>
                       <w:i/>
                       <w:color w:val="CCF0F0"/>
-                      <w:sz w:val="16"/>
+                      <w:sz w:val="17"/>
                       <w:szCs w:val="17"/>
                       <w14:textFill>
                         <w14:gradFill>
@@ -1010,8 +1089,9 @@
                       <w:b/>
                       <w:i/>
                       <w:color w:val="CCF0F0"/>
-                      <w:sz w:val="16"/>
+                      <w:sz w:val="17"/>
                       <w:szCs w:val="17"/>
+                      <w:u w:val="single"/>
                       <w14:textFill>
                         <w14:gradFill>
                           <w14:gsLst>
@@ -1040,7 +1120,45 @@
                         </w14:gradFill>
                       </w14:textFill>
                     </w:rPr>
-                    <w:t>github.com/razamughal333</w:t>
+                    <w:t>github</w:t>
+                  </w:r>
+                  <w:r>
+                    <w:rPr>
+                      <w:rFonts w:ascii="Arial" w:eastAsia="Arial" w:hAnsi="Arial" w:cs="Arial"/>
+                      <w:b/>
+                      <w:i/>
+                      <w:color w:val="CCF0F0"/>
+                      <w:sz w:val="17"/>
+                      <w:szCs w:val="17"/>
+                      <w14:textFill>
+                        <w14:gradFill>
+                          <w14:gsLst>
+                            <w14:gs w14:pos="0">
+                              <w14:schemeClr w14:val="accent1">
+                                <w14:tint w14:val="66000"/>
+                                <w14:satMod w14:val="160000"/>
+                              </w14:schemeClr>
+                            </w14:gs>
+                            <w14:gs w14:pos="50000">
+                              <w14:schemeClr w14:val="accent1">
+                                <w14:tint w14:val="44500"/>
+                                <w14:satMod w14:val="160000"/>
+                              </w14:schemeClr>
+                            </w14:gs>
+                            <w14:gs w14:pos="100000">
+                              <w14:schemeClr w14:val="accent1">
+                                <w14:tint w14:val="23500"/>
+                                <w14:satMod w14:val="160000"/>
+                              </w14:schemeClr>
+                            </w14:gs>
+                          </w14:gsLst>
+                          <w14:path w14:path="circle">
+                            <w14:fillToRect w14:l="0" w14:t="100000" w14:r="100000" w14:b="0"/>
+                          </w14:path>
+                        </w14:gradFill>
+                      </w14:textFill>
+                    </w:rPr>
+                    <w:t>.com/razamughal333</w:t>
                   </w:r>
                 </w:p>
               </w:tc>
@@ -1127,7 +1245,7 @@
           <w:sz w:val="19"/>
           <w:szCs w:val="19"/>
         </w:rPr>
-        <w:t xml:space="preserve">Frontend Developer and Computer Science graduate based in Rawalpindi, Pakistan, with hands-on </w:t>
+        <w:t>Frontend Developer and Computer Scien</w:t>
       </w:r>
       <w:r>
         <w:rPr>
@@ -1136,6 +1254,24 @@
           <w:sz w:val="19"/>
           <w:szCs w:val="19"/>
         </w:rPr>
+        <w:t>ce graduate based in Rawalpindi/Islamabad,</w:t>
+      </w:r>
+      <w:r>
+        <w:rPr>
+          <w:rFonts w:ascii="Arial" w:eastAsia="Arial" w:hAnsi="Arial" w:cs="Arial"/>
+          <w:color w:val="3B3838" w:themeColor="background2" w:themeShade="40"/>
+          <w:sz w:val="19"/>
+          <w:szCs w:val="19"/>
+        </w:rPr>
+        <w:t xml:space="preserve"> Pakistan, with hands-on </w:t>
+      </w:r>
+      <w:r>
+        <w:rPr>
+          <w:rFonts w:ascii="Arial" w:eastAsia="Arial" w:hAnsi="Arial" w:cs="Arial"/>
+          <w:color w:val="3B3838" w:themeColor="background2" w:themeShade="40"/>
+          <w:sz w:val="19"/>
+          <w:szCs w:val="19"/>
+        </w:rPr>
         <w:t xml:space="preserve">experience building responsive &amp; </w:t>
       </w:r>
       <w:r>
@@ -1145,7 +1281,7 @@
           <w:sz w:val="19"/>
           <w:szCs w:val="19"/>
         </w:rPr>
-        <w:t xml:space="preserve">modern web applications. Currently advancing through the full MERN stack with a long-term goal of transitioning into AI/ML </w:t>
+        <w:t xml:space="preserve">modern web applications. Currently advancing through the full MERN stack with a long-term </w:t>
       </w:r>
       <w:r>
         <w:rPr>
@@ -1154,7 +1290,16 @@
           <w:sz w:val="19"/>
           <w:szCs w:val="19"/>
         </w:rPr>
-        <w:t>engineering</w:t>
+        <w:t xml:space="preserve">goal </w:t>
+      </w:r>
+      <w:r>
+        <w:rPr>
+          <w:rFonts w:ascii="Arial" w:eastAsia="Arial" w:hAnsi="Arial" w:cs="Arial"/>
+          <w:color w:val="3B3838" w:themeColor="background2" w:themeShade="40"/>
+          <w:sz w:val="19"/>
+          <w:szCs w:val="19"/>
+        </w:rPr>
+        <w:t>of growing into specialized engineering roles</w:t>
       </w:r>
       <w:r>
         <w:rPr>
@@ -1276,7 +1421,7 @@
                 <w:sz w:val="19"/>
                 <w:szCs w:val="19"/>
               </w:rPr>
-              <w:t>HTML5, CSS3, JavaScript (ES6+), React</w:t>
+              <w:t xml:space="preserve">HTML5, CSS3, </w:t>
             </w:r>
             <w:r>
               <w:rPr>
@@ -1285,8 +1430,19 @@
                 <w:sz w:val="19"/>
                 <w:szCs w:val="19"/>
               </w:rPr>
-              <w:t>, Tailwind</w:t>
+              <w:t>Tailwind</w:t>
             </w:r>
+            <w:r>
+              <w:rPr>
+                <w:rFonts w:ascii="Arial" w:eastAsia="Arial" w:hAnsi="Arial" w:cs="Arial"/>
+                <w:color w:val="555555"/>
+                <w:sz w:val="19"/>
+                <w:szCs w:val="19"/>
+              </w:rPr>
+              <w:t>, React</w:t>
+            </w:r>
+            <w:bookmarkStart w:id="0" w:name="_GoBack"/>
+            <w:bookmarkEnd w:id="0"/>
           </w:p>
         </w:tc>
       </w:tr>
@@ -1309,6 +1465,16 @@
             </w:tcMar>
           </w:tcPr>
           <w:p>
+            <w:pPr>
+              <w:rPr>
+                <w:rFonts w:ascii="Arial" w:eastAsia="Arial" w:hAnsi="Arial" w:cs="Arial"/>
+                <w:b/>
+                <w:bCs/>
+                <w:color w:val="0D6E6E"/>
+                <w:sz w:val="18"/>
+                <w:szCs w:val="18"/>
+              </w:rPr>
+            </w:pPr>
             <w:r>
               <w:rPr>
                 <w:rFonts w:ascii="Arial" w:eastAsia="Arial" w:hAnsi="Arial" w:cs="Arial"/>
@@ -1318,7 +1484,7 @@
                 <w:sz w:val="18"/>
                 <w:szCs w:val="18"/>
               </w:rPr>
-              <w:t>Backend</w:t>
+              <w:t>Languages</w:t>
             </w:r>
           </w:p>
         </w:tc>
@@ -1341,87 +1507,38 @@
           <w:p>
             <w:pPr>
               <w:rPr>
-                <w:rFonts w:ascii="Arial" w:hAnsi="Arial" w:cs="Arial"/>
+                <w:rFonts w:ascii="Arial" w:eastAsia="Arial" w:hAnsi="Arial" w:cs="Arial"/>
+                <w:color w:val="555555"/>
                 <w:sz w:val="19"/>
                 <w:szCs w:val="19"/>
               </w:rPr>
             </w:pPr>
             <w:r>
               <w:rPr>
-                <w:rFonts w:ascii="Arial" w:hAnsi="Arial" w:cs="Arial"/>
-                <w:color w:val="767171" w:themeColor="background2" w:themeShade="80"/>
+                <w:rFonts w:ascii="Arial" w:eastAsia="Arial" w:hAnsi="Arial" w:cs="Arial"/>
+                <w:color w:val="555555"/>
                 <w:sz w:val="19"/>
                 <w:szCs w:val="19"/>
               </w:rPr>
-              <w:t>Node.js, Express.js (Learning)</w:t>
+              <w:t>JavaScript(ES6+),</w:t>
             </w:r>
-          </w:p>
-        </w:tc>
-      </w:tr>
-      <w:tr>
-        <w:tc>
-          <w:tcPr>
-            <w:tcW w:w="2000" w:type="dxa"/>
-            <w:tcBorders>
-              <w:top w:val="single" w:sz="1" w:space="0" w:color="DDDDDD"/>
-              <w:left w:val="single" w:sz="1" w:space="0" w:color="DDDDDD"/>
-              <w:bottom w:val="single" w:sz="1" w:space="0" w:color="DDDDDD"/>
-              <w:right w:val="single" w:sz="1" w:space="0" w:color="DDDDDD"/>
-            </w:tcBorders>
-            <w:shd w:val="clear" w:color="auto" w:fill="F9F9F9"/>
-            <w:tcMar>
-              <w:top w:w="60" w:type="dxa"/>
-              <w:left w:w="120" w:type="dxa"/>
-              <w:bottom w:w="60" w:type="dxa"/>
-              <w:right w:w="120" w:type="dxa"/>
-            </w:tcMar>
-          </w:tcPr>
-          <w:p>
             <w:r>
               <w:rPr>
                 <w:rFonts w:ascii="Arial" w:eastAsia="Arial" w:hAnsi="Arial" w:cs="Arial"/>
-                <w:b/>
-                <w:bCs/>
-                <w:color w:val="0D6E6E"/>
-                <w:sz w:val="18"/>
-                <w:szCs w:val="18"/>
-              </w:rPr>
-              <w:t>Database</w:t>
-            </w:r>
-          </w:p>
-        </w:tc>
-        <w:tc>
-          <w:tcPr>
-            <w:tcW w:w="7360" w:type="dxa"/>
-            <w:tcBorders>
-              <w:top w:val="single" w:sz="1" w:space="0" w:color="DDDDDD"/>
-              <w:left w:val="single" w:sz="1" w:space="0" w:color="DDDDDD"/>
-              <w:bottom w:val="single" w:sz="1" w:space="0" w:color="DDDDDD"/>
-              <w:right w:val="single" w:sz="1" w:space="0" w:color="DDDDDD"/>
-            </w:tcBorders>
-            <w:tcMar>
-              <w:top w:w="60" w:type="dxa"/>
-              <w:left w:w="120" w:type="dxa"/>
-              <w:bottom w:w="60" w:type="dxa"/>
-              <w:right w:w="120" w:type="dxa"/>
-            </w:tcMar>
-          </w:tcPr>
-          <w:p>
-            <w:pPr>
-              <w:rPr>
-                <w:rFonts w:ascii="Arial" w:hAnsi="Arial" w:cs="Arial"/>
+                <w:color w:val="555555"/>
                 <w:sz w:val="19"/>
                 <w:szCs w:val="19"/>
               </w:rPr>
-            </w:pPr>
+              <w:t xml:space="preserve"> </w:t>
+            </w:r>
             <w:r>
               <w:rPr>
-                <w:rFonts w:ascii="Arial" w:hAnsi="Arial" w:cs="Arial"/>
-                <w:color w:val="767171" w:themeColor="background2" w:themeShade="80"/>
+                <w:rFonts w:ascii="Arial" w:eastAsia="Arial" w:hAnsi="Arial" w:cs="Arial"/>
+                <w:color w:val="555555"/>
                 <w:sz w:val="19"/>
                 <w:szCs w:val="19"/>
               </w:rPr>
-              <w:t>MongoDB (Learning)</w:t>
+              <w:t>Typescript</w:t>
             </w:r>
           </w:p>
         </w:tc>
@@ -1482,7 +1599,16 @@
                 <w:sz w:val="19"/>
                 <w:szCs w:val="19"/>
               </w:rPr>
-              <w:t>Git, GitHub, Figma, Agile Framework</w:t>
+              <w:t>Git</w:t>
+            </w:r>
+            <w:r>
+              <w:rPr>
+                <w:rFonts w:ascii="Arial" w:eastAsia="Arial" w:hAnsi="Arial" w:cs="Arial"/>
+                <w:color w:val="555555"/>
+                <w:sz w:val="19"/>
+                <w:szCs w:val="19"/>
+              </w:rPr>
+              <w:t>, GitHub, Figma, Agile</w:t>
             </w:r>
           </w:p>
         </w:tc>
@@ -1624,7 +1750,25 @@
           <w:sz w:val="19"/>
           <w:szCs w:val="19"/>
         </w:rPr>
-        <w:t>Designed and developed a fully responsive personal portfolio website from scratch using HTML, CSS, and JavaScript. Integrated a Google Gemini 2.5 Flash AI chatbot powered by a custom system prompt to answer recruiter questions about my background and skills. Implemented API security via Google Cloud Console HTTP referrer restrictions and client-side rate limiting. Focused on clean UI, user-friendly experience, and production-ready code quality.</w:t>
+        <w:t xml:space="preserve">Designed and developed a fully responsive personal portfolio website from scratch using HTML, CSS, and JavaScript. Integrated a Google Gemini 2.5 Flash AI </w:t>
+      </w:r>
+      <w:r>
+        <w:rPr>
+          <w:rFonts w:ascii="Arial" w:eastAsia="Arial" w:hAnsi="Arial" w:cs="Arial"/>
+          <w:color w:val="3B3838" w:themeColor="background2" w:themeShade="40"/>
+          <w:sz w:val="19"/>
+          <w:szCs w:val="19"/>
+        </w:rPr>
+        <w:t>Chabot</w:t>
+      </w:r>
+      <w:r>
+        <w:rPr>
+          <w:rFonts w:ascii="Arial" w:eastAsia="Arial" w:hAnsi="Arial" w:cs="Arial"/>
+          <w:color w:val="3B3838" w:themeColor="background2" w:themeShade="40"/>
+          <w:sz w:val="19"/>
+          <w:szCs w:val="19"/>
+        </w:rPr>
+        <w:t xml:space="preserve"> powered by a custom system prompt to answer recruiter questions about my background and skills. Implemented API security via Google Cloud Console HTTP referrer restrictions and client-side rate limiting. Focused on clean UI, user-friendly experience, and production-ready code quality.</w:t>
       </w:r>
     </w:p>
     <w:p>
@@ -1747,7 +1891,7 @@
           <w:sz w:val="18"/>
           <w:szCs w:val="19"/>
         </w:rPr>
-        <w:t>tack: Next.js, Figma, HTML, Tailwind</w:t>
+        <w:t xml:space="preserve">tack: </w:t>
       </w:r>
       <w:r>
         <w:rPr>
@@ -1758,7 +1902,29 @@
           <w:sz w:val="18"/>
           <w:szCs w:val="19"/>
         </w:rPr>
-        <w:t>, JavaScript</w:t>
+        <w:t>Figma, HTML, Tailwind</w:t>
+      </w:r>
+      <w:r>
+        <w:rPr>
+          <w:rFonts w:asciiTheme="minorHAnsi" w:eastAsia="Arial" w:hAnsiTheme="minorHAnsi" w:cstheme="minorHAnsi"/>
+          <w:i/>
+          <w:iCs/>
+          <w:color w:val="3B3838" w:themeColor="background2" w:themeShade="40"/>
+          <w:sz w:val="18"/>
+          <w:szCs w:val="19"/>
+        </w:rPr>
+        <w:t>, Type</w:t>
+      </w:r>
+      <w:r>
+        <w:rPr>
+          <w:rFonts w:asciiTheme="minorHAnsi" w:eastAsia="Arial" w:hAnsiTheme="minorHAnsi" w:cstheme="minorHAnsi"/>
+          <w:i/>
+          <w:iCs/>
+          <w:color w:val="3B3838" w:themeColor="background2" w:themeShade="40"/>
+          <w:sz w:val="18"/>
+          <w:szCs w:val="19"/>
+        </w:rPr>
+        <w:t>Script</w:t>
       </w:r>
       <w:r>
         <w:rPr>
@@ -1934,6 +2100,11 @@
     </w:p>
     <w:p>
       <w:pPr>
+        <w:spacing w:after="20"/>
+      </w:pPr>
+    </w:p>
+    <w:p>
+      <w:pPr>
         <w:pBdr>
           <w:bottom w:val="single" w:sz="8" w:space="4" w:color="0D6E6E"/>
         </w:pBdr>
@@ -2305,6 +2476,7 @@
       <w:pPr>
         <w:spacing w:before="100" w:after="20"/>
       </w:pPr>
+      <w:proofErr w:type="spellStart"/>
       <w:r>
         <w:rPr>
           <w:rFonts w:ascii="Arial" w:eastAsia="Arial" w:hAnsi="Arial" w:cs="Arial"/>
@@ -2314,7 +2486,30 @@
           <w:sz w:val="19"/>
           <w:szCs w:val="19"/>
         </w:rPr>
-        <w:t>Mern Stack Development — 4-months Certified Program</w:t>
+        <w:t>Mern</w:t>
+      </w:r>
+      <w:proofErr w:type="spellEnd"/>
+      <w:r>
+        <w:rPr>
+          <w:rFonts w:ascii="Arial" w:eastAsia="Arial" w:hAnsi="Arial" w:cs="Arial"/>
+          <w:b/>
+          <w:bCs/>
+          <w:color w:val="1A1A2E"/>
+          <w:sz w:val="19"/>
+          <w:szCs w:val="19"/>
+        </w:rPr>
+        <w:t xml:space="preserve"> Stack Development — 6</w:t>
+      </w:r>
+      <w:r>
+        <w:rPr>
+          <w:rFonts w:ascii="Arial" w:eastAsia="Arial" w:hAnsi="Arial" w:cs="Arial"/>
+          <w:b/>
+          <w:bCs/>
+          <w:color w:val="1A1A2E"/>
+          <w:sz w:val="19"/>
+          <w:szCs w:val="19"/>
+        </w:rPr>
+        <w:t>-months Certified Program</w:t>
       </w:r>
       <w:r>
         <w:rPr>
@@ -2341,7 +2536,17 @@
           <w:sz w:val="18"/>
           <w:szCs w:val="18"/>
         </w:rPr>
-        <w:t xml:space="preserve"> (In Progress)</w:t>
+        <w:t xml:space="preserve"> </w:t>
+      </w:r>
+      <w:r>
+        <w:rPr>
+          <w:rFonts w:ascii="Arial" w:eastAsia="Arial" w:hAnsi="Arial" w:cs="Arial"/>
+          <w:b/>
+          <w:color w:val="404040" w:themeColor="text1" w:themeTint="BF"/>
+          <w:sz w:val="18"/>
+          <w:szCs w:val="18"/>
+        </w:rPr>
+        <w:t>(In Progress)</w:t>
       </w:r>
     </w:p>
     <w:p>
@@ -2351,6 +2556,7 @@
           <w:color w:val="3B3838" w:themeColor="background2" w:themeShade="40"/>
         </w:rPr>
       </w:pPr>
+      <w:proofErr w:type="spellStart"/>
       <w:r>
         <w:rPr>
           <w:rFonts w:ascii="Arial" w:eastAsia="Arial" w:hAnsi="Arial" w:cs="Arial"/>
@@ -2360,7 +2566,19 @@
           <w:sz w:val="18"/>
           <w:szCs w:val="18"/>
         </w:rPr>
-        <w:t>Hunarmand Punjab — Advanced Digital Skills &amp; Professional Development Program</w:t>
+        <w:t>Hunarmand</w:t>
+      </w:r>
+      <w:proofErr w:type="spellEnd"/>
+      <w:r>
+        <w:rPr>
+          <w:rFonts w:ascii="Arial" w:eastAsia="Arial" w:hAnsi="Arial" w:cs="Arial"/>
+          <w:i/>
+          <w:iCs/>
+          <w:color w:val="3B3838" w:themeColor="background2" w:themeShade="40"/>
+          <w:sz w:val="18"/>
+          <w:szCs w:val="18"/>
+        </w:rPr>
+        <w:t xml:space="preserve"> Punjab — Advanced Digital Skills &amp; Professional Development Program</w:t>
       </w:r>
     </w:p>
     <w:p>
@@ -3071,7 +3289,6 @@
   <w:style w:type="character" w:default="1" w:styleId="DefaultParagraphFont">
     <w:name w:val="Default Paragraph Font"/>
     <w:uiPriority w:val="1"/>
-    <w:semiHidden/>
     <w:unhideWhenUsed/>
   </w:style>
   <w:style w:type="table" w:default="1" w:styleId="TableNormal">
@@ -3464,7 +3681,7 @@
 </file>
 
 <file path=customXml/itemProps1.xml><?xml version="1.0" encoding="utf-8"?>
-<ds:datastoreItem xmlns:ds="http://schemas.openxmlformats.org/officeDocument/2006/customXml" ds:itemID="{9820AF79-DA0A-4A70-A00F-4E1016880AD9}">
+<ds:datastoreItem xmlns:ds="http://schemas.openxmlformats.org/officeDocument/2006/customXml" ds:itemID="{6A0CB81D-C08A-4FE1-A48A-1D002DBFB547}">
   <ds:schemaRefs>
     <ds:schemaRef ds:uri="http://schemas.openxmlformats.org/officeDocument/2006/bibliography"/>
   </ds:schemaRefs>

</xml_diff>